<commit_message>
Update Figure 2 panels, ORI base/adjusted overlay, and manuscript files
- Swap Figure 2 panel letters (B = DALY benefit-risk surface, C = threshold curves)
- Add optional contour level to Figure 2 grid; 51_* draws the Pr(BRR>1) = 0.95 contour
- Add 50_* single-panel ORI benefit-risk plane overlaying base and
  serostatus-adjusted risk (log and linear versions)
- Add scripts 46-49 (week-sweep panel, outcome-specific threshold curves,
  three-outcome BR planes, infection surface + threshold curves)
- Refresh results figures, supplementary data and manuscript files
</commit_message>
<xml_diff>
--- a/03_Manuscript/Submission/submission_naturemed/Manuscript/cover_letter_naturemed.docx
+++ b/03_Manuscript/Submission/submission_naturemed/Manuscript/cover_letter_naturemed.docx
@@ -6,127 +6,493 @@
       <w:pPr>
         <w:rPr>
           <w:rFonts w:ascii="Calibri" w:hAnsi="Calibri" w:cs="Calibri"/>
-        </w:rPr>
-      </w:pPr>
-      <w:r>
-        <w:rPr>
-          <w:rFonts w:ascii="Calibri" w:hAnsi="Calibri" w:cs="Calibri"/>
-        </w:rPr>
-        <w:t>30 Sep 2026</w:t>
+          <w:sz w:val="22"/>
+          <w:szCs w:val="22"/>
+        </w:rPr>
+      </w:pPr>
+      <w:r>
+        <w:rPr>
+          <w:rFonts w:ascii="Calibri" w:hAnsi="Calibri" w:cs="Calibri" w:hint="eastAsia"/>
+          <w:sz w:val="22"/>
+          <w:szCs w:val="22"/>
+        </w:rPr>
+        <w:t>28 Oct</w:t>
+      </w:r>
+      <w:r>
+        <w:rPr>
+          <w:rFonts w:ascii="Calibri" w:hAnsi="Calibri" w:cs="Calibri"/>
+          <w:sz w:val="22"/>
+          <w:szCs w:val="22"/>
+        </w:rPr>
+        <w:t xml:space="preserve"> 2026</w:t>
       </w:r>
     </w:p>
     <w:p>
       <w:pPr>
         <w:rPr>
           <w:rFonts w:ascii="Calibri" w:hAnsi="Calibri" w:cs="Calibri"/>
-        </w:rPr>
-      </w:pPr>
-      <w:r>
-        <w:rPr>
-          <w:rFonts w:ascii="Calibri" w:hAnsi="Calibri" w:cs="Calibri"/>
-        </w:rPr>
-        <w:t xml:space="preserve">The cover letter should: </w:t>
+          <w:sz w:val="22"/>
+          <w:szCs w:val="22"/>
+          <w:lang w:val="pt-BR"/>
+        </w:rPr>
+      </w:pPr>
+      <w:r>
+        <w:rPr>
+          <w:rFonts w:ascii="Calibri" w:hAnsi="Calibri" w:cs="Calibri"/>
+          <w:sz w:val="22"/>
+          <w:szCs w:val="22"/>
+          <w:lang w:val="pt-BR"/>
+        </w:rPr>
+        <w:t xml:space="preserve">Dear </w:t>
+      </w:r>
+      <w:r>
+        <w:rPr>
+          <w:rFonts w:ascii="Calibri" w:hAnsi="Calibri" w:cs="Calibri"/>
+          <w:sz w:val="22"/>
+          <w:szCs w:val="22"/>
+          <w:lang w:val="pt-BR"/>
+        </w:rPr>
+        <w:t xml:space="preserve">Dr. </w:t>
+      </w:r>
+      <w:r>
+        <w:rPr>
+          <w:rFonts w:ascii="Calibri" w:hAnsi="Calibri" w:cs="Calibri"/>
+          <w:sz w:val="22"/>
+          <w:szCs w:val="22"/>
+          <w:lang w:val="pt-BR"/>
+        </w:rPr>
+        <w:t>João Monteiro</w:t>
+      </w:r>
+      <w:r>
+        <w:rPr>
+          <w:rFonts w:ascii="Calibri" w:hAnsi="Calibri" w:cs="Calibri"/>
+          <w:sz w:val="22"/>
+          <w:szCs w:val="22"/>
+          <w:lang w:val="pt-BR"/>
+        </w:rPr>
+        <w:t xml:space="preserve"> and Nature Medicine Editorial Team, </w:t>
       </w:r>
     </w:p>
     <w:p>
       <w:pPr>
         <w:rPr>
           <w:rFonts w:ascii="Calibri" w:hAnsi="Calibri" w:cs="Calibri"/>
-        </w:rPr>
-      </w:pPr>
+          <w:sz w:val="22"/>
+          <w:szCs w:val="22"/>
+        </w:rPr>
+      </w:pPr>
+      <w:r>
+        <w:rPr>
+          <w:rFonts w:ascii="Calibri" w:hAnsi="Calibri" w:cs="Calibri"/>
+          <w:sz w:val="22"/>
+          <w:szCs w:val="22"/>
+        </w:rPr>
+        <w:t xml:space="preserve">We are pleased to submit our manuscript, “Benefit-risk analysis of the live-attenuated chikungunya vaccine </w:t>
+      </w:r>
+      <w:proofErr w:type="spellStart"/>
+      <w:r>
+        <w:rPr>
+          <w:rFonts w:ascii="Calibri" w:hAnsi="Calibri" w:cs="Calibri"/>
+          <w:sz w:val="22"/>
+          <w:szCs w:val="22"/>
+        </w:rPr>
+        <w:t>Ixchiq</w:t>
+      </w:r>
+      <w:proofErr w:type="spellEnd"/>
+      <w:r>
+        <w:rPr>
+          <w:rFonts w:ascii="Calibri" w:hAnsi="Calibri" w:cs="Calibri"/>
+          <w:sz w:val="22"/>
+          <w:szCs w:val="22"/>
+        </w:rPr>
+        <w:t xml:space="preserve"> for travel vaccination and outbreak response immunisation strategies: a modelling study,” for consideration in </w:t>
+      </w:r>
+      <w:r>
+        <w:rPr>
+          <w:rFonts w:ascii="Calibri" w:hAnsi="Calibri" w:cs="Calibri" w:hint="eastAsia"/>
+          <w:sz w:val="22"/>
+          <w:szCs w:val="22"/>
+        </w:rPr>
+        <w:t>Nature Medicine</w:t>
+      </w:r>
+      <w:r>
+        <w:rPr>
+          <w:rFonts w:ascii="Calibri" w:hAnsi="Calibri" w:cs="Calibri"/>
+          <w:sz w:val="22"/>
+          <w:szCs w:val="22"/>
+        </w:rPr>
+        <w:t>.</w:t>
+      </w:r>
     </w:p>
     <w:p>
       <w:pPr>
-        <w:pStyle w:val="ListParagraph"/>
-        <w:numPr>
-          <w:ilvl w:val="0"/>
-          <w:numId w:val="1"/>
-        </w:numPr>
-        <w:rPr>
-          <w:rFonts w:ascii="Calibri" w:hAnsi="Calibri" w:cs="Calibri"/>
-        </w:rPr>
-      </w:pPr>
-      <w:r>
-        <w:rPr>
-          <w:rFonts w:ascii="Calibri" w:hAnsi="Calibri" w:cs="Calibri"/>
-        </w:rPr>
-        <w:t>Disclose details of any related manuscripts that all authors have under consideration or in press elsewhere.</w:t>
+        <w:rPr>
+          <w:rFonts w:ascii="Calibri" w:hAnsi="Calibri" w:cs="Calibri"/>
+          <w:sz w:val="22"/>
+          <w:szCs w:val="22"/>
+        </w:rPr>
+      </w:pPr>
+      <w:r>
+        <w:rPr>
+          <w:rFonts w:ascii="Calibri" w:hAnsi="Calibri" w:cs="Calibri" w:hint="eastAsia"/>
+          <w:sz w:val="22"/>
+          <w:szCs w:val="22"/>
+        </w:rPr>
+        <w:t>Our study has two key findings</w:t>
+      </w:r>
+      <w:r>
+        <w:rPr>
+          <w:rFonts w:ascii="Calibri" w:hAnsi="Calibri" w:cs="Calibri"/>
+          <w:sz w:val="22"/>
+          <w:szCs w:val="22"/>
+        </w:rPr>
+        <w:t xml:space="preserve">. For travel vaccination, </w:t>
+      </w:r>
+      <w:r>
+        <w:rPr>
+          <w:rFonts w:ascii="Calibri" w:hAnsi="Calibri" w:cs="Calibri" w:hint="eastAsia"/>
+          <w:sz w:val="22"/>
+          <w:szCs w:val="22"/>
+        </w:rPr>
+        <w:t xml:space="preserve">the </w:t>
+      </w:r>
+      <w:r>
+        <w:rPr>
+          <w:rFonts w:ascii="Calibri" w:eastAsia="Malgun Gothic" w:hAnsi="Calibri" w:cs="Calibri"/>
+          <w:sz w:val="22"/>
+          <w:szCs w:val="22"/>
+        </w:rPr>
+        <w:t xml:space="preserve">benefits of </w:t>
+      </w:r>
+      <w:proofErr w:type="spellStart"/>
+      <w:r>
+        <w:rPr>
+          <w:rFonts w:ascii="Calibri" w:eastAsia="Malgun Gothic" w:hAnsi="Calibri" w:cs="Calibri"/>
+          <w:sz w:val="22"/>
+          <w:szCs w:val="22"/>
+        </w:rPr>
+        <w:t>Ixchiq</w:t>
+      </w:r>
+      <w:proofErr w:type="spellEnd"/>
+      <w:r>
+        <w:rPr>
+          <w:rFonts w:ascii="Calibri" w:eastAsia="Malgun Gothic" w:hAnsi="Calibri" w:cs="Calibri"/>
+          <w:sz w:val="22"/>
+          <w:szCs w:val="22"/>
+        </w:rPr>
+        <w:t xml:space="preserve"> outweighed </w:t>
+      </w:r>
+      <w:r>
+        <w:rPr>
+          <w:rFonts w:ascii="Calibri" w:eastAsia="Malgun Gothic" w:hAnsi="Calibri" w:cs="Calibri" w:hint="eastAsia"/>
+          <w:sz w:val="22"/>
+          <w:szCs w:val="22"/>
+        </w:rPr>
+        <w:t xml:space="preserve">the </w:t>
+      </w:r>
+      <w:r>
+        <w:rPr>
+          <w:rFonts w:ascii="Calibri" w:eastAsia="Malgun Gothic" w:hAnsi="Calibri" w:cs="Calibri"/>
+          <w:sz w:val="22"/>
+          <w:szCs w:val="22"/>
+        </w:rPr>
+        <w:t xml:space="preserve">risks for adults aged 18-64 years travelling for ≥7 days to moderate-to-high transmission settings, </w:t>
+      </w:r>
+      <w:r>
+        <w:rPr>
+          <w:rFonts w:ascii="Calibri" w:eastAsia="Malgun Gothic" w:hAnsi="Calibri" w:cs="Calibri" w:hint="eastAsia"/>
+          <w:sz w:val="22"/>
+          <w:szCs w:val="22"/>
+        </w:rPr>
+        <w:t>but not for</w:t>
+      </w:r>
+      <w:r>
+        <w:rPr>
+          <w:rFonts w:ascii="Calibri" w:eastAsia="Malgun Gothic" w:hAnsi="Calibri" w:cs="Calibri"/>
+          <w:sz w:val="22"/>
+          <w:szCs w:val="22"/>
+        </w:rPr>
+        <w:t xml:space="preserve"> adults aged ≥65 years</w:t>
+      </w:r>
+      <w:r>
+        <w:rPr>
+          <w:rFonts w:ascii="Calibri" w:hAnsi="Calibri" w:cs="Calibri"/>
+          <w:sz w:val="22"/>
+          <w:szCs w:val="22"/>
+        </w:rPr>
+        <w:t xml:space="preserve">. </w:t>
+      </w:r>
+      <w:r>
+        <w:rPr>
+          <w:rFonts w:ascii="Calibri" w:hAnsi="Calibri" w:cs="Calibri"/>
+          <w:sz w:val="22"/>
+          <w:szCs w:val="22"/>
+        </w:rPr>
+        <w:t>For outbreak response immunisation, benefits outweighed risks for adults aged 18-64 years, and for ≥65 years benefits outweighed risks when the vaccine protected against both infection and disease.</w:t>
       </w:r>
     </w:p>
     <w:p>
       <w:pPr>
-        <w:pStyle w:val="ListParagraph"/>
-        <w:numPr>
-          <w:ilvl w:val="0"/>
-          <w:numId w:val="1"/>
-        </w:numPr>
-        <w:rPr>
-          <w:rFonts w:ascii="Calibri" w:hAnsi="Calibri" w:cs="Calibri"/>
-        </w:rPr>
-      </w:pPr>
-      <w:r>
-        <w:rPr>
-          <w:rFonts w:ascii="Calibri" w:hAnsi="Calibri" w:cs="Calibri"/>
-        </w:rPr>
-        <w:t>Let us know whether you have had any prior discussions with a Nature Medicine editor about the work described in the manuscript.</w:t>
+        <w:rPr>
+          <w:rFonts w:ascii="Calibri" w:hAnsi="Calibri" w:cs="Calibri"/>
+          <w:sz w:val="22"/>
+          <w:szCs w:val="22"/>
+        </w:rPr>
+      </w:pPr>
+      <w:r>
+        <w:rPr>
+          <w:rFonts w:ascii="Calibri" w:hAnsi="Calibri" w:cs="Calibri"/>
+          <w:sz w:val="22"/>
+          <w:szCs w:val="22"/>
+        </w:rPr>
+        <w:t>The manuscript was developed with co-authors directly engaged in chikungunya vaccine policy discussions, including Cristiana Toscano and Kaja Abbas. They serve as chair and member respectively of the WHO SAGE Working Group on Chikungunya vaccines and are reviewing the scientific evidence and relevant programmatic considerations to formulate recommendations on the use of chikungunya vaccines. We presented the</w:t>
+      </w:r>
+      <w:r>
+        <w:rPr>
+          <w:rFonts w:ascii="Calibri" w:hAnsi="Calibri" w:cs="Calibri" w:hint="eastAsia"/>
+          <w:sz w:val="22"/>
+          <w:szCs w:val="22"/>
+        </w:rPr>
+        <w:t>se</w:t>
+      </w:r>
+      <w:r>
+        <w:rPr>
+          <w:rFonts w:ascii="Calibri" w:hAnsi="Calibri" w:cs="Calibri"/>
+          <w:sz w:val="22"/>
+          <w:szCs w:val="22"/>
+        </w:rPr>
+        <w:t xml:space="preserve"> findings to the WHO SAGE Working Group on Chikungunya vaccines on 16 April 202</w:t>
+      </w:r>
+      <w:r>
+        <w:rPr>
+          <w:rFonts w:ascii="Calibri" w:eastAsia="Malgun Gothic" w:hAnsi="Calibri" w:cs="Calibri"/>
+          <w:sz w:val="22"/>
+          <w:szCs w:val="22"/>
+        </w:rPr>
+        <w:t>6</w:t>
+      </w:r>
+      <w:r>
+        <w:rPr>
+          <w:rFonts w:ascii="Calibri" w:hAnsi="Calibri" w:cs="Calibri"/>
+          <w:sz w:val="22"/>
+          <w:szCs w:val="22"/>
+        </w:rPr>
+        <w:t xml:space="preserve"> to inform </w:t>
+      </w:r>
+      <w:r>
+        <w:rPr>
+          <w:rFonts w:ascii="Calibri" w:hAnsi="Calibri" w:cs="Calibri" w:hint="eastAsia"/>
+          <w:sz w:val="22"/>
+          <w:szCs w:val="22"/>
+        </w:rPr>
+        <w:t xml:space="preserve">its </w:t>
+      </w:r>
+      <w:r>
+        <w:rPr>
+          <w:rFonts w:ascii="Calibri" w:hAnsi="Calibri" w:cs="Calibri"/>
+          <w:sz w:val="22"/>
+          <w:szCs w:val="22"/>
+        </w:rPr>
+        <w:t>ongoing benefit-risk deliberations. This manuscript represents the authors’ independent scientific analysis</w:t>
+      </w:r>
+      <w:r>
+        <w:rPr>
+          <w:rFonts w:ascii="Calibri" w:hAnsi="Calibri" w:cs="Calibri" w:hint="eastAsia"/>
+          <w:sz w:val="22"/>
+          <w:szCs w:val="22"/>
+        </w:rPr>
+        <w:t xml:space="preserve"> </w:t>
+      </w:r>
+      <w:r>
+        <w:rPr>
+          <w:rFonts w:ascii="Calibri" w:hAnsi="Calibri" w:cs="Calibri"/>
+          <w:sz w:val="22"/>
+          <w:szCs w:val="22"/>
+        </w:rPr>
+        <w:t xml:space="preserve">and </w:t>
+      </w:r>
+      <w:r>
+        <w:rPr>
+          <w:rFonts w:ascii="Calibri" w:hAnsi="Calibri" w:cs="Calibri" w:hint="eastAsia"/>
+          <w:sz w:val="22"/>
+          <w:szCs w:val="22"/>
+        </w:rPr>
+        <w:t>does not reflect a</w:t>
+      </w:r>
+      <w:r>
+        <w:rPr>
+          <w:rFonts w:ascii="Calibri" w:hAnsi="Calibri" w:cs="Calibri"/>
+          <w:sz w:val="22"/>
+          <w:szCs w:val="22"/>
+        </w:rPr>
+        <w:t xml:space="preserve"> formal WHO or SAGE position.</w:t>
       </w:r>
     </w:p>
     <w:p>
       <w:pPr>
-        <w:pStyle w:val="ListParagraph"/>
-        <w:numPr>
-          <w:ilvl w:val="0"/>
-          <w:numId w:val="1"/>
-        </w:numPr>
-        <w:rPr>
-          <w:rFonts w:ascii="Calibri" w:hAnsi="Calibri" w:cs="Calibri"/>
-        </w:rPr>
-      </w:pPr>
-      <w:r>
-        <w:rPr>
-          <w:rFonts w:ascii="Calibri" w:hAnsi="Calibri" w:cs="Calibri"/>
-        </w:rPr>
-        <w:t xml:space="preserve">If choosing double-anonymized peer review, include the affiliation and contact information for all authors (instead of putting it in the manuscript file). </w:t>
+        <w:rPr>
+          <w:rFonts w:ascii="Calibri" w:hAnsi="Calibri" w:cs="Calibri"/>
+          <w:sz w:val="22"/>
+          <w:szCs w:val="22"/>
+        </w:rPr>
+      </w:pPr>
+      <w:r>
+        <w:rPr>
+          <w:rFonts w:ascii="Calibri" w:hAnsi="Calibri" w:cs="Calibri"/>
+          <w:sz w:val="22"/>
+          <w:szCs w:val="22"/>
+        </w:rPr>
+        <w:t>We believe the revised manuscript provides timely evidence on benefit-risk assessment for age-specific and setting-specific chikungunya vaccine decision-making for travel vaccination and outbreak response immunisation.</w:t>
       </w:r>
     </w:p>
     <w:p>
       <w:pPr>
-        <w:pStyle w:val="ListParagraph"/>
-        <w:numPr>
-          <w:ilvl w:val="0"/>
-          <w:numId w:val="1"/>
-        </w:numPr>
-        <w:rPr>
-          <w:rFonts w:ascii="Calibri" w:hAnsi="Calibri" w:cs="Calibri"/>
-        </w:rPr>
-      </w:pPr>
-      <w:r>
-        <w:rPr>
-          <w:rFonts w:ascii="Calibri" w:hAnsi="Calibri" w:cs="Calibri"/>
-        </w:rPr>
-        <w:t>OPTIONAL. Provide the name and institution of reviewers you would like to recommend and/or people you would like to be excluded from peer review (explaining why).</w:t>
+        <w:rPr>
+          <w:rFonts w:ascii="Calibri" w:hAnsi="Calibri" w:cs="Calibri"/>
+          <w:sz w:val="22"/>
+          <w:szCs w:val="22"/>
+        </w:rPr>
+      </w:pPr>
+      <w:r>
+        <w:rPr>
+          <w:rFonts w:ascii="Calibri" w:hAnsi="Calibri" w:cs="Calibri"/>
+          <w:sz w:val="22"/>
+          <w:szCs w:val="22"/>
+        </w:rPr>
+        <w:t>We confirm that this manuscript has not been published and is not under consideration elsewhere, and that none of the authors have related manuscripts under consideration or in press elsewhere. We have not had any prior discussions with a Nature Medicine editor about this work. All authors have approved the submitted version, and we declare no competing interests.</w:t>
       </w:r>
     </w:p>
     <w:p>
       <w:pPr>
-        <w:pStyle w:val="ListParagraph"/>
-        <w:numPr>
-          <w:ilvl w:val="0"/>
-          <w:numId w:val="1"/>
-        </w:numPr>
-        <w:rPr>
-          <w:rFonts w:ascii="Calibri" w:hAnsi="Calibri" w:cs="Calibri"/>
-        </w:rPr>
-      </w:pPr>
-      <w:r>
-        <w:rPr>
-          <w:rFonts w:ascii="Calibri" w:hAnsi="Calibri" w:cs="Calibri"/>
-        </w:rPr>
-        <w:t>The cover letter is not seen by peer reviewers.</w:t>
+        <w:rPr>
+          <w:rFonts w:ascii="Calibri" w:hAnsi="Calibri" w:cs="Calibri"/>
+          <w:sz w:val="22"/>
+          <w:szCs w:val="22"/>
+        </w:rPr>
+      </w:pPr>
+      <w:proofErr w:type="spellStart"/>
+      <w:r>
+        <w:rPr>
+          <w:rFonts w:ascii="Calibri" w:hAnsi="Calibri" w:cs="Calibri"/>
+          <w:sz w:val="22"/>
+          <w:szCs w:val="22"/>
+        </w:rPr>
+        <w:t>Kind</w:t>
+      </w:r>
+      <w:proofErr w:type="spellEnd"/>
+      <w:r>
+        <w:rPr>
+          <w:rFonts w:ascii="Calibri" w:hAnsi="Calibri" w:cs="Calibri"/>
+          <w:sz w:val="22"/>
+          <w:szCs w:val="22"/>
+        </w:rPr>
+        <w:t xml:space="preserve"> regards,</w:t>
       </w:r>
     </w:p>
+    <w:p>
+      <w:pPr>
+        <w:rPr>
+          <w:rFonts w:ascii="Calibri" w:hAnsi="Calibri" w:cs="Calibri"/>
+          <w:sz w:val="22"/>
+          <w:szCs w:val="22"/>
+        </w:rPr>
+      </w:pPr>
+      <w:r>
+        <w:rPr>
+          <w:rFonts w:ascii="Calibri" w:hAnsi="Calibri" w:cs="Calibri"/>
+          <w:noProof/>
+          <w:sz w:val="22"/>
+          <w:szCs w:val="22"/>
+        </w:rPr>
+        <w:drawing>
+          <wp:inline distT="0" distB="0" distL="0" distR="0" wp14:anchorId="7CA744A4" wp14:editId="3801532C">
+            <wp:extent cx="1048096" cy="422385"/>
+            <wp:effectExtent l="0" t="0" r="0" b="0"/>
+            <wp:docPr id="758677965" name="그림 1" descr="친필, 서예, 폰트, 화이트이(가) 표시된 사진&#10;&#10;자동 생성된 설명">
+              <a:extLst xmlns:a="http://schemas.openxmlformats.org/drawingml/2006/main">
+                <a:ext uri="{FF2B5EF4-FFF2-40B4-BE49-F238E27FC236}">
+                  <a16:creationId xmlns:a16="http://schemas.microsoft.com/office/drawing/2014/main" id="{1FC6C76A-6BC0-45E2-86EC-BD596D8EB9F1}"/>
+                </a:ext>
+              </a:extLst>
+            </wp:docPr>
+            <wp:cNvGraphicFramePr>
+              <a:graphicFrameLocks xmlns:a="http://schemas.openxmlformats.org/drawingml/2006/main" noChangeAspect="1"/>
+            </wp:cNvGraphicFramePr>
+            <a:graphic xmlns:a="http://schemas.openxmlformats.org/drawingml/2006/main">
+              <a:graphicData uri="http://schemas.openxmlformats.org/drawingml/2006/picture">
+                <pic:pic xmlns:pic="http://schemas.openxmlformats.org/drawingml/2006/picture">
+                  <pic:nvPicPr>
+                    <pic:cNvPr id="758677965" name="그림 1" descr="친필, 서예, 폰트, 화이트이(가) 표시된 사진&#10;&#10;자동 생성된 설명"/>
+                    <pic:cNvPicPr/>
+                  </pic:nvPicPr>
+                  <pic:blipFill rotWithShape="1">
+                    <a:blip r:embed="rId7"/>
+                    <a:srcRect l="17433" t="12500" r="20439" b="12500"/>
+                    <a:stretch/>
+                  </pic:blipFill>
+                  <pic:spPr bwMode="auto">
+                    <a:xfrm>
+                      <a:off x="0" y="0"/>
+                      <a:ext cx="1048096" cy="422385"/>
+                    </a:xfrm>
+                    <a:prstGeom prst="rect">
+                      <a:avLst/>
+                    </a:prstGeom>
+                    <a:ln>
+                      <a:noFill/>
+                    </a:ln>
+                  </pic:spPr>
+                </pic:pic>
+              </a:graphicData>
+            </a:graphic>
+          </wp:inline>
+        </w:drawing>
+      </w:r>
+    </w:p>
+    <w:p>
+      <w:pPr>
+        <w:rPr>
+          <w:rFonts w:ascii="Calibri" w:hAnsi="Calibri" w:cs="Calibri"/>
+          <w:sz w:val="22"/>
+          <w:szCs w:val="22"/>
+        </w:rPr>
+      </w:pPr>
+      <w:r>
+        <w:rPr>
+          <w:rFonts w:ascii="Calibri" w:hAnsi="Calibri" w:cs="Calibri"/>
+          <w:sz w:val="22"/>
+          <w:szCs w:val="22"/>
+        </w:rPr>
+        <w:t xml:space="preserve">Hyolim Kang </w:t>
+      </w:r>
+    </w:p>
+    <w:p>
+      <w:pPr>
+        <w:rPr>
+          <w:rFonts w:ascii="Calibri" w:hAnsi="Calibri" w:cs="Calibri"/>
+          <w:sz w:val="22"/>
+          <w:szCs w:val="22"/>
+        </w:rPr>
+      </w:pPr>
+      <w:r>
+        <w:rPr>
+          <w:rFonts w:ascii="Calibri" w:hAnsi="Calibri" w:cs="Calibri"/>
+          <w:sz w:val="22"/>
+          <w:szCs w:val="22"/>
+        </w:rPr>
+        <w:t>(on behalf of all authors)</w:t>
+      </w:r>
+    </w:p>
+    <w:p>
+      <w:pPr>
+        <w:rPr>
+          <w:rFonts w:ascii="Calibri" w:hAnsi="Calibri" w:cs="Calibri"/>
+        </w:rPr>
+      </w:pPr>
+    </w:p>
+    <w:p/>
     <w:sectPr>
-      <w:headerReference w:type="default" r:id="rId7"/>
+      <w:headerReference w:type="default" r:id="rId8"/>
       <w:pgSz w:w="11906" w:h="16838"/>
       <w:pgMar w:top="1440" w:right="1440" w:bottom="1440" w:left="1440" w:header="708" w:footer="708" w:gutter="0"/>
       <w:cols w:space="708"/>
@@ -190,7 +556,7 @@
 <w:hdr xmlns:wpc="http://schemas.microsoft.com/office/word/2010/wordprocessingCanvas" xmlns:cx="http://schemas.microsoft.com/office/drawing/2014/chartex" xmlns:cx1="http://schemas.microsoft.com/office/drawing/2015/9/8/chartex" xmlns:cx2="http://schemas.microsoft.com/office/drawing/2015/10/21/chartex" xmlns:cx3="http://schemas.microsoft.com/office/drawing/2016/5/9/chartex" xmlns:cx4="http://schemas.microsoft.com/office/drawing/2016/5/10/chartex" xmlns:cx5="http://schemas.microsoft.com/office/drawing/2016/5/11/chartex" xmlns:cx6="http://schemas.microsoft.com/office/drawing/2016/5/12/chartex" xmlns:cx7="http://schemas.microsoft.com/office/drawing/2016/5/13/chartex" xmlns:cx8="http://schemas.microsoft.com/office/drawing/2016/5/14/chartex" xmlns:mc="http://schemas.openxmlformats.org/markup-compatibility/2006" xmlns:aink="http://schemas.microsoft.com/office/drawing/2016/ink" xmlns:am3d="http://schemas.microsoft.com/office/drawing/2017/model3d" xmlns:o="urn:schemas-microsoft-com:office:office" xmlns:oel="http://schemas.microsoft.com/office/2019/extlst" xmlns:r="http://schemas.openxmlformats.org/officeDocument/2006/relationships" xmlns:m="http://schemas.openxmlformats.org/officeDocument/2006/math" xmlns:v="urn:schemas-microsoft-com:vml" xmlns:wp14="http://schemas.microsoft.com/office/word/2010/wordprocessingDrawing" xmlns:wp="http://schemas.openxmlformats.org/drawingml/2006/wordprocessingDrawing" xmlns:w10="urn:schemas-microsoft-com:office:word" xmlns:w="http://schemas.openxmlformats.org/wordprocessingml/2006/main" xmlns:w14="http://schemas.microsoft.com/office/word/2010/wordml" xmlns:w15="http://schemas.microsoft.com/office/word/2012/wordml" xmlns:w16cex="http://schemas.microsoft.com/office/word/2018/wordml/cex" xmlns:w16cid="http://schemas.microsoft.com/office/word/2016/wordml/cid" xmlns:w16="http://schemas.microsoft.com/office/word/2018/wordml" xmlns:w16du="http://schemas.microsoft.com/office/word/2023/wordml/word16du" xmlns:w16sdtdh="http://schemas.microsoft.com/office/word/2020/wordml/sdtdatahash" xmlns:w16sdtfl="http://schemas.microsoft.com/office/word/2024/wordml/sdtformatlock" xmlns:w16se="http://schemas.microsoft.com/office/word/2015/wordml/symex" xmlns:wpg="http://schemas.microsoft.com/office/word/2010/wordprocessingGroup" xmlns:wpi="http://schemas.microsoft.com/office/word/2010/wordprocessingInk" xmlns:wne="http://schemas.microsoft.com/office/word/2006/wordml" xmlns:wps="http://schemas.microsoft.com/office/word/2010/wordprocessingShape" mc:Ignorable="w14 w15 w16se w16cid w16 w16cex w16sdtdh w16sdtfl w16du wp14">
   <w:p>
     <w:pPr>
-      <w:pStyle w:val="Header"/>
+      <w:pStyle w:val="aa"/>
       <w:spacing w:line="276" w:lineRule="auto"/>
       <w:ind w:left="5310"/>
       <w:rPr>
@@ -280,7 +646,7 @@
   </w:p>
   <w:p>
     <w:pPr>
-      <w:pStyle w:val="Header"/>
+      <w:pStyle w:val="aa"/>
       <w:spacing w:line="276" w:lineRule="auto"/>
       <w:ind w:left="5310"/>
       <w:rPr>
@@ -298,7 +664,7 @@
   </w:p>
   <w:p>
     <w:pPr>
-      <w:pStyle w:val="Header"/>
+      <w:pStyle w:val="aa"/>
       <w:spacing w:line="276" w:lineRule="auto"/>
       <w:ind w:left="5310"/>
       <w:rPr>
@@ -316,7 +682,7 @@
   </w:p>
   <w:p>
     <w:pPr>
-      <w:pStyle w:val="Header"/>
+      <w:pStyle w:val="aa"/>
       <w:spacing w:line="276" w:lineRule="auto"/>
       <w:ind w:left="5310"/>
       <w:rPr>
@@ -336,7 +702,7 @@
   </w:p>
   <w:p>
     <w:pPr>
-      <w:pStyle w:val="Header"/>
+      <w:pStyle w:val="aa"/>
       <w:spacing w:line="276" w:lineRule="auto"/>
       <w:ind w:left="5310"/>
       <w:rPr>
@@ -351,18 +717,8 @@
         <w:szCs w:val="18"/>
         <w:lang w:val="pt-BR"/>
       </w:rPr>
-      <w:t xml:space="preserve">1-12-3 Sakamoto, Nagasaki 852-8523, </w:t>
+      <w:t>1-12-3 Sakamoto, Nagasaki 852-8523, Japan</w:t>
     </w:r>
-    <w:proofErr w:type="spellStart"/>
-    <w:r>
-      <w:rPr>
-        <w:sz w:val="18"/>
-        <w:szCs w:val="18"/>
-        <w:lang w:val="pt-BR"/>
-      </w:rPr>
-      <w:t>Japan</w:t>
-    </w:r>
-    <w:proofErr w:type="spellEnd"/>
     <w:r>
       <w:softHyphen/>
     </w:r>
@@ -372,7 +728,7 @@
   </w:p>
   <w:p>
     <w:pPr>
-      <w:pStyle w:val="Header"/>
+      <w:pStyle w:val="aa"/>
       <w:spacing w:line="276" w:lineRule="auto"/>
       <w:ind w:left="5310"/>
       <w:rPr>
@@ -392,7 +748,7 @@
   </w:p>
   <w:p>
     <w:pPr>
-      <w:pStyle w:val="Header"/>
+      <w:pStyle w:val="aa"/>
       <w:spacing w:line="276" w:lineRule="auto"/>
       <w:ind w:left="5310"/>
       <w:rPr>
@@ -404,7 +760,7 @@
     <w:hyperlink r:id="rId2">
       <w:r>
         <w:rPr>
-          <w:rStyle w:val="Hyperlink"/>
+          <w:rStyle w:val="ac"/>
           <w:sz w:val="18"/>
           <w:szCs w:val="18"/>
           <w:lang w:val="pt-BR"/>
@@ -415,7 +771,7 @@
   </w:p>
   <w:p>
     <w:pPr>
-      <w:pStyle w:val="Header"/>
+      <w:pStyle w:val="aa"/>
       <w:spacing w:line="276" w:lineRule="auto"/>
       <w:ind w:left="5310"/>
       <w:rPr>
@@ -427,7 +783,7 @@
     <w:hyperlink r:id="rId3">
       <w:r>
         <w:rPr>
-          <w:rStyle w:val="Hyperlink"/>
+          <w:rStyle w:val="ac"/>
           <w:sz w:val="18"/>
           <w:szCs w:val="18"/>
           <w:lang w:val="pt-BR"/>
@@ -438,7 +794,7 @@
   </w:p>
   <w:p>
     <w:pPr>
-      <w:pStyle w:val="Header"/>
+      <w:pStyle w:val="aa"/>
       <w:rPr>
         <w:lang w:val="pt-BR"/>
       </w:rPr>
@@ -965,15 +1321,15 @@
     <w:lsdException w:name="Unresolved Mention" w:semiHidden="1" w:unhideWhenUsed="1"/>
     <w:lsdException w:name="Smart Link" w:semiHidden="1" w:unhideWhenUsed="1"/>
   </w:latentStyles>
-  <w:style w:type="paragraph" w:default="1" w:styleId="Normal">
+  <w:style w:type="paragraph" w:default="1" w:styleId="a">
     <w:name w:val="Normal"/>
     <w:qFormat/>
   </w:style>
-  <w:style w:type="paragraph" w:styleId="Heading1">
+  <w:style w:type="paragraph" w:styleId="1">
     <w:name w:val="heading 1"/>
-    <w:basedOn w:val="Normal"/>
-    <w:next w:val="Normal"/>
-    <w:link w:val="Heading1Char"/>
+    <w:basedOn w:val="a"/>
+    <w:next w:val="a"/>
+    <w:link w:val="1Char"/>
     <w:uiPriority w:val="9"/>
     <w:qFormat/>
     <w:rsid w:val="00F3312E"/>
@@ -990,11 +1346,11 @@
       <w:szCs w:val="40"/>
     </w:rPr>
   </w:style>
-  <w:style w:type="paragraph" w:styleId="Heading2">
+  <w:style w:type="paragraph" w:styleId="2">
     <w:name w:val="heading 2"/>
-    <w:basedOn w:val="Normal"/>
-    <w:next w:val="Normal"/>
-    <w:link w:val="Heading2Char"/>
+    <w:basedOn w:val="a"/>
+    <w:next w:val="a"/>
+    <w:link w:val="2Char"/>
     <w:uiPriority w:val="9"/>
     <w:semiHidden/>
     <w:unhideWhenUsed/>
@@ -1013,11 +1369,11 @@
       <w:szCs w:val="32"/>
     </w:rPr>
   </w:style>
-  <w:style w:type="paragraph" w:styleId="Heading3">
+  <w:style w:type="paragraph" w:styleId="3">
     <w:name w:val="heading 3"/>
-    <w:basedOn w:val="Normal"/>
-    <w:next w:val="Normal"/>
-    <w:link w:val="Heading3Char"/>
+    <w:basedOn w:val="a"/>
+    <w:next w:val="a"/>
+    <w:link w:val="3Char"/>
     <w:uiPriority w:val="9"/>
     <w:semiHidden/>
     <w:unhideWhenUsed/>
@@ -1036,11 +1392,11 @@
       <w:szCs w:val="28"/>
     </w:rPr>
   </w:style>
-  <w:style w:type="paragraph" w:styleId="Heading4">
+  <w:style w:type="paragraph" w:styleId="4">
     <w:name w:val="heading 4"/>
-    <w:basedOn w:val="Normal"/>
-    <w:next w:val="Normal"/>
-    <w:link w:val="Heading4Char"/>
+    <w:basedOn w:val="a"/>
+    <w:next w:val="a"/>
+    <w:link w:val="4Char"/>
     <w:uiPriority w:val="9"/>
     <w:semiHidden/>
     <w:unhideWhenUsed/>
@@ -1059,11 +1415,11 @@
       <w:color w:val="0F4761" w:themeColor="accent1" w:themeShade="BF"/>
     </w:rPr>
   </w:style>
-  <w:style w:type="paragraph" w:styleId="Heading5">
+  <w:style w:type="paragraph" w:styleId="5">
     <w:name w:val="heading 5"/>
-    <w:basedOn w:val="Normal"/>
-    <w:next w:val="Normal"/>
-    <w:link w:val="Heading5Char"/>
+    <w:basedOn w:val="a"/>
+    <w:next w:val="a"/>
+    <w:link w:val="5Char"/>
     <w:uiPriority w:val="9"/>
     <w:semiHidden/>
     <w:unhideWhenUsed/>
@@ -1080,11 +1436,11 @@
       <w:color w:val="0F4761" w:themeColor="accent1" w:themeShade="BF"/>
     </w:rPr>
   </w:style>
-  <w:style w:type="paragraph" w:styleId="Heading6">
+  <w:style w:type="paragraph" w:styleId="6">
     <w:name w:val="heading 6"/>
-    <w:basedOn w:val="Normal"/>
-    <w:next w:val="Normal"/>
-    <w:link w:val="Heading6Char"/>
+    <w:basedOn w:val="a"/>
+    <w:next w:val="a"/>
+    <w:link w:val="6Char"/>
     <w:uiPriority w:val="9"/>
     <w:semiHidden/>
     <w:unhideWhenUsed/>
@@ -1103,11 +1459,11 @@
       <w:color w:val="595959" w:themeColor="text1" w:themeTint="A6"/>
     </w:rPr>
   </w:style>
-  <w:style w:type="paragraph" w:styleId="Heading7">
+  <w:style w:type="paragraph" w:styleId="7">
     <w:name w:val="heading 7"/>
-    <w:basedOn w:val="Normal"/>
-    <w:next w:val="Normal"/>
-    <w:link w:val="Heading7Char"/>
+    <w:basedOn w:val="a"/>
+    <w:next w:val="a"/>
+    <w:link w:val="7Char"/>
     <w:uiPriority w:val="9"/>
     <w:semiHidden/>
     <w:unhideWhenUsed/>
@@ -1124,11 +1480,11 @@
       <w:color w:val="595959" w:themeColor="text1" w:themeTint="A6"/>
     </w:rPr>
   </w:style>
-  <w:style w:type="paragraph" w:styleId="Heading8">
+  <w:style w:type="paragraph" w:styleId="8">
     <w:name w:val="heading 8"/>
-    <w:basedOn w:val="Normal"/>
-    <w:next w:val="Normal"/>
-    <w:link w:val="Heading8Char"/>
+    <w:basedOn w:val="a"/>
+    <w:next w:val="a"/>
+    <w:link w:val="8Char"/>
     <w:uiPriority w:val="9"/>
     <w:semiHidden/>
     <w:unhideWhenUsed/>
@@ -1147,11 +1503,11 @@
       <w:color w:val="272727" w:themeColor="text1" w:themeTint="D8"/>
     </w:rPr>
   </w:style>
-  <w:style w:type="paragraph" w:styleId="Heading9">
+  <w:style w:type="paragraph" w:styleId="9">
     <w:name w:val="heading 9"/>
-    <w:basedOn w:val="Normal"/>
-    <w:next w:val="Normal"/>
-    <w:link w:val="Heading9Char"/>
+    <w:basedOn w:val="a"/>
+    <w:next w:val="a"/>
+    <w:link w:val="9Char"/>
     <w:uiPriority w:val="9"/>
     <w:semiHidden/>
     <w:unhideWhenUsed/>
@@ -1168,13 +1524,12 @@
       <w:color w:val="272727" w:themeColor="text1" w:themeTint="D8"/>
     </w:rPr>
   </w:style>
-  <w:style w:type="character" w:default="1" w:styleId="DefaultParagraphFont">
+  <w:style w:type="character" w:default="1" w:styleId="a0">
     <w:name w:val="Default Paragraph Font"/>
     <w:uiPriority w:val="1"/>
-    <w:semiHidden/>
     <w:unhideWhenUsed/>
   </w:style>
-  <w:style w:type="table" w:default="1" w:styleId="TableNormal">
+  <w:style w:type="table" w:default="1" w:styleId="a1">
     <w:name w:val="Normal Table"/>
     <w:uiPriority w:val="99"/>
     <w:semiHidden/>
@@ -1189,16 +1544,16 @@
       </w:tblCellMar>
     </w:tblPr>
   </w:style>
-  <w:style w:type="numbering" w:default="1" w:styleId="NoList">
+  <w:style w:type="numbering" w:default="1" w:styleId="a2">
     <w:name w:val="No List"/>
     <w:uiPriority w:val="99"/>
     <w:semiHidden/>
     <w:unhideWhenUsed/>
   </w:style>
-  <w:style w:type="character" w:customStyle="1" w:styleId="Heading1Char">
-    <w:name w:val="Heading 1 Char"/>
-    <w:basedOn w:val="DefaultParagraphFont"/>
-    <w:link w:val="Heading1"/>
+  <w:style w:type="character" w:customStyle="1" w:styleId="1Char">
+    <w:name w:val="제목 1 Char"/>
+    <w:basedOn w:val="a0"/>
+    <w:link w:val="1"/>
     <w:uiPriority w:val="9"/>
     <w:rsid w:val="00F3312E"/>
     <w:rPr>
@@ -1208,10 +1563,10 @@
       <w:szCs w:val="40"/>
     </w:rPr>
   </w:style>
-  <w:style w:type="character" w:customStyle="1" w:styleId="Heading2Char">
-    <w:name w:val="Heading 2 Char"/>
-    <w:basedOn w:val="DefaultParagraphFont"/>
-    <w:link w:val="Heading2"/>
+  <w:style w:type="character" w:customStyle="1" w:styleId="2Char">
+    <w:name w:val="제목 2 Char"/>
+    <w:basedOn w:val="a0"/>
+    <w:link w:val="2"/>
     <w:uiPriority w:val="9"/>
     <w:semiHidden/>
     <w:rsid w:val="00F3312E"/>
@@ -1222,10 +1577,10 @@
       <w:szCs w:val="32"/>
     </w:rPr>
   </w:style>
-  <w:style w:type="character" w:customStyle="1" w:styleId="Heading3Char">
-    <w:name w:val="Heading 3 Char"/>
-    <w:basedOn w:val="DefaultParagraphFont"/>
-    <w:link w:val="Heading3"/>
+  <w:style w:type="character" w:customStyle="1" w:styleId="3Char">
+    <w:name w:val="제목 3 Char"/>
+    <w:basedOn w:val="a0"/>
+    <w:link w:val="3"/>
     <w:uiPriority w:val="9"/>
     <w:semiHidden/>
     <w:rsid w:val="00F3312E"/>
@@ -1236,10 +1591,10 @@
       <w:szCs w:val="28"/>
     </w:rPr>
   </w:style>
-  <w:style w:type="character" w:customStyle="1" w:styleId="Heading4Char">
-    <w:name w:val="Heading 4 Char"/>
-    <w:basedOn w:val="DefaultParagraphFont"/>
-    <w:link w:val="Heading4"/>
+  <w:style w:type="character" w:customStyle="1" w:styleId="4Char">
+    <w:name w:val="제목 4 Char"/>
+    <w:basedOn w:val="a0"/>
+    <w:link w:val="4"/>
     <w:uiPriority w:val="9"/>
     <w:semiHidden/>
     <w:rsid w:val="00F3312E"/>
@@ -1250,10 +1605,10 @@
       <w:color w:val="0F4761" w:themeColor="accent1" w:themeShade="BF"/>
     </w:rPr>
   </w:style>
-  <w:style w:type="character" w:customStyle="1" w:styleId="Heading5Char">
-    <w:name w:val="Heading 5 Char"/>
-    <w:basedOn w:val="DefaultParagraphFont"/>
-    <w:link w:val="Heading5"/>
+  <w:style w:type="character" w:customStyle="1" w:styleId="5Char">
+    <w:name w:val="제목 5 Char"/>
+    <w:basedOn w:val="a0"/>
+    <w:link w:val="5"/>
     <w:uiPriority w:val="9"/>
     <w:semiHidden/>
     <w:rsid w:val="00F3312E"/>
@@ -1262,10 +1617,10 @@
       <w:color w:val="0F4761" w:themeColor="accent1" w:themeShade="BF"/>
     </w:rPr>
   </w:style>
-  <w:style w:type="character" w:customStyle="1" w:styleId="Heading6Char">
-    <w:name w:val="Heading 6 Char"/>
-    <w:basedOn w:val="DefaultParagraphFont"/>
-    <w:link w:val="Heading6"/>
+  <w:style w:type="character" w:customStyle="1" w:styleId="6Char">
+    <w:name w:val="제목 6 Char"/>
+    <w:basedOn w:val="a0"/>
+    <w:link w:val="6"/>
     <w:uiPriority w:val="9"/>
     <w:semiHidden/>
     <w:rsid w:val="00F3312E"/>
@@ -1276,10 +1631,10 @@
       <w:color w:val="595959" w:themeColor="text1" w:themeTint="A6"/>
     </w:rPr>
   </w:style>
-  <w:style w:type="character" w:customStyle="1" w:styleId="Heading7Char">
-    <w:name w:val="Heading 7 Char"/>
-    <w:basedOn w:val="DefaultParagraphFont"/>
-    <w:link w:val="Heading7"/>
+  <w:style w:type="character" w:customStyle="1" w:styleId="7Char">
+    <w:name w:val="제목 7 Char"/>
+    <w:basedOn w:val="a0"/>
+    <w:link w:val="7"/>
     <w:uiPriority w:val="9"/>
     <w:semiHidden/>
     <w:rsid w:val="00F3312E"/>
@@ -1288,10 +1643,10 @@
       <w:color w:val="595959" w:themeColor="text1" w:themeTint="A6"/>
     </w:rPr>
   </w:style>
-  <w:style w:type="character" w:customStyle="1" w:styleId="Heading8Char">
-    <w:name w:val="Heading 8 Char"/>
-    <w:basedOn w:val="DefaultParagraphFont"/>
-    <w:link w:val="Heading8"/>
+  <w:style w:type="character" w:customStyle="1" w:styleId="8Char">
+    <w:name w:val="제목 8 Char"/>
+    <w:basedOn w:val="a0"/>
+    <w:link w:val="8"/>
     <w:uiPriority w:val="9"/>
     <w:semiHidden/>
     <w:rsid w:val="00F3312E"/>
@@ -1302,10 +1657,10 @@
       <w:color w:val="272727" w:themeColor="text1" w:themeTint="D8"/>
     </w:rPr>
   </w:style>
-  <w:style w:type="character" w:customStyle="1" w:styleId="Heading9Char">
-    <w:name w:val="Heading 9 Char"/>
-    <w:basedOn w:val="DefaultParagraphFont"/>
-    <w:link w:val="Heading9"/>
+  <w:style w:type="character" w:customStyle="1" w:styleId="9Char">
+    <w:name w:val="제목 9 Char"/>
+    <w:basedOn w:val="a0"/>
+    <w:link w:val="9"/>
     <w:uiPriority w:val="9"/>
     <w:semiHidden/>
     <w:rsid w:val="00F3312E"/>
@@ -1314,11 +1669,11 @@
       <w:color w:val="272727" w:themeColor="text1" w:themeTint="D8"/>
     </w:rPr>
   </w:style>
-  <w:style w:type="paragraph" w:styleId="Title">
+  <w:style w:type="paragraph" w:styleId="a3">
     <w:name w:val="Title"/>
-    <w:basedOn w:val="Normal"/>
-    <w:next w:val="Normal"/>
-    <w:link w:val="TitleChar"/>
+    <w:basedOn w:val="a"/>
+    <w:next w:val="a"/>
+    <w:link w:val="Char"/>
     <w:uiPriority w:val="10"/>
     <w:qFormat/>
     <w:rsid w:val="00F3312E"/>
@@ -1334,10 +1689,10 @@
       <w:szCs w:val="56"/>
     </w:rPr>
   </w:style>
-  <w:style w:type="character" w:customStyle="1" w:styleId="TitleChar">
-    <w:name w:val="Title Char"/>
-    <w:basedOn w:val="DefaultParagraphFont"/>
-    <w:link w:val="Title"/>
+  <w:style w:type="character" w:customStyle="1" w:styleId="Char">
+    <w:name w:val="제목 Char"/>
+    <w:basedOn w:val="a0"/>
+    <w:link w:val="a3"/>
     <w:uiPriority w:val="10"/>
     <w:rsid w:val="00F3312E"/>
     <w:rPr>
@@ -1348,11 +1703,11 @@
       <w:szCs w:val="56"/>
     </w:rPr>
   </w:style>
-  <w:style w:type="paragraph" w:styleId="Subtitle">
+  <w:style w:type="paragraph" w:styleId="a4">
     <w:name w:val="Subtitle"/>
-    <w:basedOn w:val="Normal"/>
-    <w:next w:val="Normal"/>
-    <w:link w:val="SubtitleChar"/>
+    <w:basedOn w:val="a"/>
+    <w:next w:val="a"/>
+    <w:link w:val="Char0"/>
     <w:uiPriority w:val="11"/>
     <w:qFormat/>
     <w:rsid w:val="00F3312E"/>
@@ -1369,10 +1724,10 @@
       <w:szCs w:val="28"/>
     </w:rPr>
   </w:style>
-  <w:style w:type="character" w:customStyle="1" w:styleId="SubtitleChar">
-    <w:name w:val="Subtitle Char"/>
-    <w:basedOn w:val="DefaultParagraphFont"/>
-    <w:link w:val="Subtitle"/>
+  <w:style w:type="character" w:customStyle="1" w:styleId="Char0">
+    <w:name w:val="부제 Char"/>
+    <w:basedOn w:val="a0"/>
+    <w:link w:val="a4"/>
     <w:uiPriority w:val="11"/>
     <w:rsid w:val="00F3312E"/>
     <w:rPr>
@@ -1383,11 +1738,11 @@
       <w:szCs w:val="28"/>
     </w:rPr>
   </w:style>
-  <w:style w:type="paragraph" w:styleId="Quote">
+  <w:style w:type="paragraph" w:styleId="a5">
     <w:name w:val="Quote"/>
-    <w:basedOn w:val="Normal"/>
-    <w:next w:val="Normal"/>
-    <w:link w:val="QuoteChar"/>
+    <w:basedOn w:val="a"/>
+    <w:next w:val="a"/>
+    <w:link w:val="Char1"/>
     <w:uiPriority w:val="29"/>
     <w:qFormat/>
     <w:rsid w:val="00F3312E"/>
@@ -1401,10 +1756,10 @@
       <w:color w:val="404040" w:themeColor="text1" w:themeTint="BF"/>
     </w:rPr>
   </w:style>
-  <w:style w:type="character" w:customStyle="1" w:styleId="QuoteChar">
-    <w:name w:val="Quote Char"/>
-    <w:basedOn w:val="DefaultParagraphFont"/>
-    <w:link w:val="Quote"/>
+  <w:style w:type="character" w:customStyle="1" w:styleId="Char1">
+    <w:name w:val="인용 Char"/>
+    <w:basedOn w:val="a0"/>
+    <w:link w:val="a5"/>
     <w:uiPriority w:val="29"/>
     <w:rsid w:val="00F3312E"/>
     <w:rPr>
@@ -1413,9 +1768,9 @@
       <w:color w:val="404040" w:themeColor="text1" w:themeTint="BF"/>
     </w:rPr>
   </w:style>
-  <w:style w:type="paragraph" w:styleId="ListParagraph">
+  <w:style w:type="paragraph" w:styleId="a6">
     <w:name w:val="List Paragraph"/>
-    <w:basedOn w:val="Normal"/>
+    <w:basedOn w:val="a"/>
     <w:uiPriority w:val="34"/>
     <w:qFormat/>
     <w:rsid w:val="00F3312E"/>
@@ -1424,9 +1779,9 @@
       <w:contextualSpacing/>
     </w:pPr>
   </w:style>
-  <w:style w:type="character" w:styleId="IntenseEmphasis">
+  <w:style w:type="character" w:styleId="a7">
     <w:name w:val="Intense Emphasis"/>
-    <w:basedOn w:val="DefaultParagraphFont"/>
+    <w:basedOn w:val="a0"/>
     <w:uiPriority w:val="21"/>
     <w:qFormat/>
     <w:rsid w:val="00F3312E"/>
@@ -1436,11 +1791,11 @@
       <w:color w:val="0F4761" w:themeColor="accent1" w:themeShade="BF"/>
     </w:rPr>
   </w:style>
-  <w:style w:type="paragraph" w:styleId="IntenseQuote">
+  <w:style w:type="paragraph" w:styleId="a8">
     <w:name w:val="Intense Quote"/>
-    <w:basedOn w:val="Normal"/>
-    <w:next w:val="Normal"/>
-    <w:link w:val="IntenseQuoteChar"/>
+    <w:basedOn w:val="a"/>
+    <w:next w:val="a"/>
+    <w:link w:val="Char2"/>
     <w:uiPriority w:val="30"/>
     <w:qFormat/>
     <w:rsid w:val="00F3312E"/>
@@ -1459,10 +1814,10 @@
       <w:color w:val="0F4761" w:themeColor="accent1" w:themeShade="BF"/>
     </w:rPr>
   </w:style>
-  <w:style w:type="character" w:customStyle="1" w:styleId="IntenseQuoteChar">
-    <w:name w:val="Intense Quote Char"/>
-    <w:basedOn w:val="DefaultParagraphFont"/>
-    <w:link w:val="IntenseQuote"/>
+  <w:style w:type="character" w:customStyle="1" w:styleId="Char2">
+    <w:name w:val="강한 인용 Char"/>
+    <w:basedOn w:val="a0"/>
+    <w:link w:val="a8"/>
     <w:uiPriority w:val="30"/>
     <w:rsid w:val="00F3312E"/>
     <w:rPr>
@@ -1471,9 +1826,9 @@
       <w:color w:val="0F4761" w:themeColor="accent1" w:themeShade="BF"/>
     </w:rPr>
   </w:style>
-  <w:style w:type="character" w:styleId="IntenseReference">
+  <w:style w:type="character" w:styleId="a9">
     <w:name w:val="Intense Reference"/>
-    <w:basedOn w:val="DefaultParagraphFont"/>
+    <w:basedOn w:val="a0"/>
     <w:uiPriority w:val="32"/>
     <w:qFormat/>
     <w:rsid w:val="00F3312E"/>
@@ -1485,10 +1840,10 @@
       <w:spacing w:val="5"/>
     </w:rPr>
   </w:style>
-  <w:style w:type="paragraph" w:styleId="Header">
+  <w:style w:type="paragraph" w:styleId="aa">
     <w:name w:val="header"/>
-    <w:basedOn w:val="Normal"/>
-    <w:link w:val="HeaderChar"/>
+    <w:basedOn w:val="a"/>
+    <w:link w:val="Char3"/>
     <w:uiPriority w:val="99"/>
     <w:unhideWhenUsed/>
     <w:rsid w:val="00F3312E"/>
@@ -1500,17 +1855,17 @@
       <w:spacing w:after="0" w:line="240" w:lineRule="auto"/>
     </w:pPr>
   </w:style>
-  <w:style w:type="character" w:customStyle="1" w:styleId="HeaderChar">
-    <w:name w:val="Header Char"/>
-    <w:basedOn w:val="DefaultParagraphFont"/>
-    <w:link w:val="Header"/>
+  <w:style w:type="character" w:customStyle="1" w:styleId="Char3">
+    <w:name w:val="머리글 Char"/>
+    <w:basedOn w:val="a0"/>
+    <w:link w:val="aa"/>
     <w:uiPriority w:val="99"/>
     <w:rsid w:val="00F3312E"/>
   </w:style>
-  <w:style w:type="paragraph" w:styleId="Footer">
+  <w:style w:type="paragraph" w:styleId="ab">
     <w:name w:val="footer"/>
-    <w:basedOn w:val="Normal"/>
-    <w:link w:val="FooterChar"/>
+    <w:basedOn w:val="a"/>
+    <w:link w:val="Char4"/>
     <w:uiPriority w:val="99"/>
     <w:unhideWhenUsed/>
     <w:rsid w:val="00F3312E"/>
@@ -1522,16 +1877,16 @@
       <w:spacing w:after="0" w:line="240" w:lineRule="auto"/>
     </w:pPr>
   </w:style>
-  <w:style w:type="character" w:customStyle="1" w:styleId="FooterChar">
-    <w:name w:val="Footer Char"/>
-    <w:basedOn w:val="DefaultParagraphFont"/>
-    <w:link w:val="Footer"/>
+  <w:style w:type="character" w:customStyle="1" w:styleId="Char4">
+    <w:name w:val="바닥글 Char"/>
+    <w:basedOn w:val="a0"/>
+    <w:link w:val="ab"/>
     <w:uiPriority w:val="99"/>
     <w:rsid w:val="00F3312E"/>
   </w:style>
-  <w:style w:type="character" w:styleId="Hyperlink">
+  <w:style w:type="character" w:styleId="ac">
     <w:name w:val="Hyperlink"/>
-    <w:basedOn w:val="DefaultParagraphFont"/>
+    <w:basedOn w:val="a0"/>
     <w:uiPriority w:val="99"/>
     <w:unhideWhenUsed/>
     <w:rsid w:val="00F3312E"/>
@@ -1539,6 +1894,34 @@
       <w:color w:val="467886" w:themeColor="hyperlink"/>
       <w:u w:val="single"/>
     </w:rPr>
+  </w:style>
+  <w:style w:type="paragraph" w:styleId="ad">
+    <w:name w:val="Date"/>
+    <w:basedOn w:val="a"/>
+    <w:next w:val="a"/>
+    <w:link w:val="Char5"/>
+    <w:uiPriority w:val="99"/>
+    <w:semiHidden/>
+    <w:unhideWhenUsed/>
+    <w:rsid w:val="006863DE"/>
+  </w:style>
+  <w:style w:type="character" w:customStyle="1" w:styleId="Char5">
+    <w:name w:val="날짜 Char"/>
+    <w:basedOn w:val="a0"/>
+    <w:link w:val="ad"/>
+    <w:uiPriority w:val="99"/>
+    <w:semiHidden/>
+    <w:rsid w:val="006863DE"/>
+  </w:style>
+  <w:style w:type="paragraph" w:styleId="ae">
+    <w:name w:val="Revision"/>
+    <w:hidden/>
+    <w:uiPriority w:val="99"/>
+    <w:semiHidden/>
+    <w:rsid w:val="00211B8F"/>
+    <w:pPr>
+      <w:spacing w:after="0" w:line="240" w:lineRule="auto"/>
+    </w:pPr>
   </w:style>
 </w:styles>
 </file>

</xml_diff>